<commit_message>
Fix IEEE paper terminology and section numbering
</commit_message>
<xml_diff>
--- a/Article6_English_IEEE.docx
+++ b/Article6_English_IEEE.docx
@@ -611,7 +611,7 @@
           <w:i w:val="0"/>
           <w:iCs w:val="0"/>
         </w:rPr>
-        <w:t>Quadrupedal manipulators combine terrain adaptability and environmental interaction for disaster response, hazardous operations, and campus inspection. This paper presents a Mecanum-wheeled quadrupedal mobile manipulator and heterogeneous teleoperation system. Each leg has two pitch joints and one wheel-drive degree of freedom; The four Mecanum wheels enable omnidirectional planar motion. Hierarchical torque feedforward combines single-leg virtual-work mapping and whole-body single-rigid-body modeling, with attitude feedback adjusting leg length. The six-axis arm uses analytical inverse kinematics through position–orientation decomposition. A Delta parallel mechanism provides master position input, and a three-axis handle with three encoders provides orientation input. Frame calibration and pose mapping convert these inputs into arm joint commands. The framework connects mechanism design, kinematic modeling, model-based feedforward, and joint control to support system design and implementation. Physical demonstrations illustrate system operation.</w:t>
+        <w:t>Quadrupedal manipulators combine terrain adaptability and environmental interaction for disaster response, hazardous operations, and campus inspection. This paper presents a Mecanum-wheeled quadrupedal mobile manipulator and heterogeneous teleoperation system. Each leg has two pitch joints and one wheel-drive degree of freedom; the four Mecanum wheels enable omnidirectional planar motion. Hierarchical torque feedforward combines single-leg virtual-work mapping and whole-body single-rigid-body modeling, with attitude feedback adjusting leg length. The six-axis arm uses analytical inverse kinematics through position–orientation decomposition. A Delta parallel mechanism provides master position input, and a three-axis handle with three encoders provides orientation input. Frame calibration and pose mapping convert these inputs into arm joint commands. The framework connects mechanism design, kinematic modeling, model-based feedforward, and joint control to support system design and implementation. Physical demonstrations illustrate system operation.</w:t>
       </w:r>
     </w:p>
     <w:p ns2:paraId="1BD36AE0" ns2:textId="77777777">
@@ -821,9 +821,13 @@
     </w:p>
     <w:p ns2:paraId="794118F6" ns2:textId="77777777">
       <w:pPr>
-        <w:pStyle w:val="Normal"/>
+        <w:pStyle w:val="Heading2"/>
         <w:snapToGrid w:val="0"/>
         <w:widowControl/>
+        <w:numPr>
+          <w:ilvl w:val="1"/>
+          <w:numId w:val="4"/>
+        </w:numPr>
         <w:keepNext/>
         <w:keepLines/>
         <w:rPr>
@@ -849,6 +853,16 @@
         </w:rPr>
         <w:t xml:space="preserve">System Architecture and Notation</w:t>
       </w:r>
+      <w:r/>
+    </w:p>
+    <w:p>
+      <w:pPr>
+        <w:pStyle w:val="Normal"/>
+        <w:numPr>
+          <w:ilvl w:val="0"/>
+          <w:numId w:val="0"/>
+        </w:numPr>
+      </w:pPr>
       <w:r>
         <w:br w:type="column"/>
       </w:r>
@@ -20150,7 +20164,7 @@
         <w:rPr>
           <w:sz w:val="19"/>
         </w:rPr>
-        <w:t>Following Pieper’s analytical solution for a six-axis arm with a spherical wrist [9], the inverse kinematics separates wrist-center positioning from wrist orientation. Given the end-effector target p₀₆ and orientation R₀₆ in frame {0}, the wrist center is pW = p₀₆ − d₆R₀₆eᵧ, where eᵧ is the tool-frame +y unit vector and d₆ is the tool offset. Let ρW = √(xW² + yW²), ρA = √((ρW − a₁)² + (zW − d₁)²), γA = atan2(zW − d₁, ρW − a₁), ℓ₂ = a₂, and ℓ₃ = d₄. Here a₁, d₁, a₂, and d₄ are DH geometric parameters; d₄ locates the wrist center along z₃. The selected arm branch is:</w:t>
+        <w:t>Following Pieper’s analytical solution for a six-axis arm with a spherical wrist [9], the inverse kinematics separates wrist-center positioning from wrist orientation. Given the end-effector target p₀₆ and orientation R₀₆ in frame {0}, the wrist center is pW = p₀₆ − d₆R₀₆eᵧ, where eᵧ is the tool-frame +y unit vector and d₆ is the tool offset. Let ρW = √(xW² + yW²), ρA = √((ρW − a₁)² + (zW − d₁)²), γA = atan2(zW − d₁, ρW − a₁), ℓ₂ = a₂, and ℓ₃ = d₄. Here a₁, d₁, a₂, and d₄ are Denavit–Hartenberg (DH) geometric parameters; d₄ locates the wrist center along z₃. The selected arm branch is:</w:t>
       </w:r>
     </w:p>
     <w:p>
@@ -34033,15 +34047,22 @@
         </w:rPr>
       </w:pPr>
       <w:r>
+        <w:rPr>
+          <w:sz w:val="16"/>
+        </w:rPr>
         <w:t xml:space="preserve">Z. Bian and X. Wang, </w:t>
       </w:r>
       <w:r>
         <w:rPr>
           <w:i/>
+          <w:sz w:val="16"/>
         </w:rPr>
         <w:t>Quadruped Robot Control Algorithms: Modeling, Control, and Practice</w:t>
       </w:r>
       <w:r>
+        <w:rPr>
+          <w:sz w:val="16"/>
+        </w:rPr>
         <w:t xml:space="preserve"> (in Chinese). Beijing, China: China Machine Press, 2023.</w:t>
       </w:r>
     </w:p>

</xml_diff>

<commit_message>
Fill author affiliations in Article 6
</commit_message>
<xml_diff>
--- a/Article6_English_IEEE.docx
+++ b/Article6_English_IEEE.docx
@@ -46,9 +46,8 @@
         </w:tblBorders>
       </w:tblPr>
       <w:tblGrid>
-        <w:gridCol w:w="3485"/>
-        <w:gridCol w:w="3485"/>
-        <w:gridCol w:w="3485"/>
+        <w:gridCol w:w="5227"/>
+        <w:gridCol w:w="5227"/>
       </w:tblGrid>
       <w:tr>
         <w:trPr>
@@ -56,7 +55,7 @@
         </w:trPr>
         <w:tc>
           <w:tcPr>
-            <w:tcW w:w="3485" w:type="dxa"/>
+            <w:tcW w:w="5227" w:type="dxa"/>
             <w:vAlign w:val="top"/>
             <w:tcMar>
               <w:top w:w="0" w:type="dxa"/>
@@ -77,223 +76,40 @@
               <w:keepNext w:val="0"/>
             </w:pPr>
             <w:r>
-              <w:rPr>
-                <w:sz w:val="18"/>
-                <w:szCs w:val="18"/>
-              </w:rPr>
-              <w:t>line 1</w:t>
+              <w:t>Suya Zhao</w:t>
             </w:r>
             <w:r>
-              <w:rPr>
-                <w:sz w:val="18"/>
-                <w:szCs w:val="18"/>
-              </w:rPr>
-              <w:t>: 1</w:t>
-            </w:r>
-            <w:r>
-              <w:rPr>
-                <w:sz w:val="18"/>
-                <w:szCs w:val="18"/>
-                <w:vertAlign w:val="superscript"/>
-              </w:rPr>
-              <w:t>st</w:t>
-            </w:r>
-            <w:r>
-              <w:rPr>
-                <w:sz w:val="18"/>
-                <w:szCs w:val="18"/>
-              </w:rPr>
-              <w:t xml:space="preserve"> </w:t>
-            </w:r>
-            <w:r>
-              <w:rPr>
-                <w:sz w:val="18"/>
-                <w:szCs w:val="18"/>
-              </w:rPr>
-              <w:t>Given Name Surname</w:t>
-            </w:r>
-            <w:r>
-              <w:rPr>
-                <w:sz w:val="18"/>
-                <w:szCs w:val="18"/>
-              </w:rPr>
-              <w:t xml:space="preserve"> </w:t>
-            </w:r>
-            <w:r>
-              <w:rPr>
-                <w:sz w:val="18"/>
-                <w:szCs w:val="18"/>
-              </w:rPr>
-              <w:br/>
-              <w:t>line 2:</w:t>
-            </w:r>
-            <w:r>
-              <w:rPr>
-                <w:sz w:val="18"/>
-                <w:szCs w:val="18"/>
-              </w:rPr>
-              <w:t xml:space="preserve"> </w:t>
-            </w:r>
-            <w:r>
-              <w:rPr>
-                <w:i/>
-                <w:sz w:val="18"/>
-                <w:szCs w:val="18"/>
-              </w:rPr>
-              <w:t>dept. name of organization</w:t>
-            </w:r>
-            <w:r>
-              <w:rPr>
-                <w:i/>
-                <w:sz w:val="18"/>
-                <w:szCs w:val="18"/>
-              </w:rPr>
-              <w:t xml:space="preserve"> (of </w:t>
-            </w:r>
-            <w:r>
-              <w:rPr>
-                <w:i/>
-                <w:iCs/>
-                <w:sz w:val="18"/>
-                <w:szCs w:val="18"/>
-              </w:rPr>
-              <w:t>Affiliation</w:t>
-            </w:r>
-            <w:r>
-              <w:rPr>
-                <w:i/>
-                <w:sz w:val="18"/>
-                <w:szCs w:val="18"/>
-              </w:rPr>
-              <w:t>)</w:t>
-            </w:r>
-            <w:r>
-              <w:rPr>
-                <w:sz w:val="18"/>
-                <w:szCs w:val="18"/>
-              </w:rPr>
               <w:br/>
             </w:r>
             <w:r>
               <w:rPr>
-                <w:sz w:val="18"/>
-                <w:szCs w:val="18"/>
-              </w:rPr>
-              <w:t>li</w:t>
+                <w:i/>
+              </w:rPr>
+              <w:t>Faculty of Information</w:t>
             </w:r>
             <w:r>
-              <w:rPr>
-                <w:sz w:val="18"/>
-                <w:szCs w:val="18"/>
-              </w:rPr>
-              <w:t xml:space="preserve">ne </w:t>
-            </w:r>
-            <w:r>
-              <w:rPr>
-                <w:sz w:val="18"/>
-                <w:szCs w:val="18"/>
-              </w:rPr>
-              <w:t>3</w:t>
-            </w:r>
-            <w:r>
-              <w:rPr>
-                <w:sz w:val="18"/>
-                <w:szCs w:val="18"/>
-              </w:rPr>
-              <w:t xml:space="preserve">: </w:t>
-            </w:r>
-            <w:r>
-              <w:rPr>
-                <w:i/>
-                <w:sz w:val="18"/>
-                <w:szCs w:val="18"/>
-              </w:rPr>
-              <w:t xml:space="preserve">name of organization </w:t>
-            </w:r>
-            <w:r>
-              <w:rPr>
-                <w:i/>
-                <w:sz w:val="18"/>
-                <w:szCs w:val="18"/>
-              </w:rPr>
-              <w:t>(of Affiliation)</w:t>
-            </w:r>
-            <w:r>
-              <w:rPr>
-                <w:i/>
-                <w:sz w:val="18"/>
-                <w:szCs w:val="18"/>
-              </w:rPr>
               <w:br/>
             </w:r>
             <w:r>
-              <w:rPr>
-                <w:sz w:val="18"/>
-                <w:szCs w:val="18"/>
-              </w:rPr>
-              <w:t xml:space="preserve">line </w:t>
+              <w:t>Harbin Institute of Technology, Shenzhen</w:t>
             </w:r>
             <w:r>
-              <w:rPr>
-                <w:sz w:val="18"/>
-                <w:szCs w:val="18"/>
-              </w:rPr>
-              <w:t>4</w:t>
-            </w:r>
-            <w:r>
-              <w:rPr>
-                <w:sz w:val="18"/>
-                <w:szCs w:val="18"/>
-              </w:rPr>
-              <w:t>: City, Country</w:t>
-            </w:r>
-            <w:r>
-              <w:rPr>
-                <w:sz w:val="18"/>
-                <w:szCs w:val="18"/>
-              </w:rPr>
               <w:br/>
             </w:r>
             <w:r>
-              <w:rPr>
-                <w:sz w:val="18"/>
-                <w:szCs w:val="18"/>
-              </w:rPr>
-              <w:t xml:space="preserve">line </w:t>
+              <w:t>Shenzhen, China</w:t>
             </w:r>
             <w:r>
-              <w:rPr>
-                <w:sz w:val="18"/>
-                <w:szCs w:val="18"/>
-              </w:rPr>
-              <w:t>5: e</w:t>
+              <w:br/>
             </w:r>
             <w:r>
-              <w:rPr>
-                <w:sz w:val="18"/>
-                <w:szCs w:val="18"/>
-              </w:rPr>
-              <w:t>ma</w:t>
-            </w:r>
-            <w:r>
-              <w:rPr>
-                <w:sz w:val="18"/>
-                <w:szCs w:val="18"/>
-              </w:rPr>
-              <w:t>il address</w:t>
-            </w:r>
-            <w:r>
-              <w:rPr>
-                <w:sz w:val="18"/>
-                <w:szCs w:val="18"/>
-              </w:rPr>
-              <w:t xml:space="preserve"> or ORCID</w:t>
+              <w:t>2024311101@stu.hit.edu.cn</w:t>
             </w:r>
           </w:p>
         </w:tc>
         <w:tc>
           <w:tcPr>
-            <w:tcW w:w="3485" w:type="dxa"/>
+            <w:tcW w:w="5227" w:type="dxa"/>
             <w:vAlign w:val="top"/>
             <w:tcMar>
               <w:top w:w="0" w:type="dxa"/>
@@ -314,244 +130,34 @@
               <w:keepNext w:val="0"/>
             </w:pPr>
             <w:r>
-              <w:rPr>
-                <w:sz w:val="18"/>
-                <w:szCs w:val="18"/>
-              </w:rPr>
-              <w:t>line 1: 2</w:t>
+              <w:t>Yue Ding</w:t>
             </w:r>
             <w:r>
-              <w:rPr>
-                <w:sz w:val="18"/>
-                <w:szCs w:val="18"/>
-                <w:vertAlign w:val="superscript"/>
-              </w:rPr>
-              <w:t>nd</w:t>
-            </w:r>
-            <w:r>
-              <w:rPr>
-                <w:sz w:val="18"/>
-                <w:szCs w:val="18"/>
-              </w:rPr>
-              <w:t xml:space="preserve"> </w:t>
-            </w:r>
-            <w:r>
-              <w:rPr>
-                <w:sz w:val="18"/>
-                <w:szCs w:val="18"/>
-              </w:rPr>
-              <w:t>Given Name Surname</w:t>
-            </w:r>
-            <w:r>
-              <w:rPr>
-                <w:sz w:val="18"/>
-                <w:szCs w:val="18"/>
-              </w:rPr>
-              <w:br/>
-              <w:t xml:space="preserve">line 2: </w:t>
-            </w:r>
-            <w:r>
-              <w:rPr>
-                <w:i/>
-                <w:sz w:val="18"/>
-                <w:szCs w:val="18"/>
-              </w:rPr>
-              <w:t xml:space="preserve">dept. name of organization (of </w:t>
-            </w:r>
-            <w:r>
-              <w:rPr>
-                <w:i/>
-                <w:iCs/>
-                <w:sz w:val="18"/>
-                <w:szCs w:val="18"/>
-              </w:rPr>
-              <w:t>Affiliation</w:t>
-            </w:r>
-            <w:r>
-              <w:rPr>
-                <w:i/>
-                <w:sz w:val="18"/>
-                <w:szCs w:val="18"/>
-              </w:rPr>
-              <w:t>)</w:t>
-            </w:r>
-            <w:r>
-              <w:rPr>
-                <w:sz w:val="18"/>
-                <w:szCs w:val="18"/>
-              </w:rPr>
-              <w:br/>
-              <w:t xml:space="preserve">line 3: </w:t>
-            </w:r>
-            <w:r>
-              <w:rPr>
-                <w:i/>
-                <w:sz w:val="18"/>
-                <w:szCs w:val="18"/>
-              </w:rPr>
-              <w:t>name of organization (of Affiliation)</w:t>
-            </w:r>
-            <w:r>
-              <w:rPr>
-                <w:i/>
-                <w:sz w:val="18"/>
-                <w:szCs w:val="18"/>
-              </w:rPr>
               <w:br/>
             </w:r>
             <w:r>
               <w:rPr>
-                <w:sz w:val="18"/>
-                <w:szCs w:val="18"/>
-              </w:rPr>
-              <w:t>line 4: City, Country</w:t>
+                <w:i/>
+              </w:rPr>
+              <w:t>Faculty of Intelligence</w:t>
             </w:r>
             <w:r>
-              <w:rPr>
-                <w:sz w:val="18"/>
-                <w:szCs w:val="18"/>
-              </w:rPr>
-              <w:br/>
-              <w:t>line 5: email address</w:t>
-            </w:r>
-            <w:r>
-              <w:rPr>
-                <w:sz w:val="18"/>
-                <w:szCs w:val="18"/>
-              </w:rPr>
-              <w:t xml:space="preserve"> or ORCID</w:t>
-            </w:r>
-          </w:p>
-        </w:tc>
-        <w:tc>
-          <w:tcPr>
-            <w:tcW w:w="3485" w:type="dxa"/>
-            <w:vAlign w:val="top"/>
-            <w:tcMar>
-              <w:top w:w="0" w:type="dxa"/>
-              <w:bottom w:w="0" w:type="dxa"/>
-              <w:left w:w="108" w:type="dxa"/>
-              <w:right w:w="108" w:type="dxa"/>
-            </w:tcMar>
-          </w:tcPr>
-          <w:p>
-            <w:pPr>
-              <w:pStyle w:val="Author"/>
-              <w:spacing w:before="100" w:beforeAutospacing="1"/>
-              <w:rPr>
-                <w:sz w:val="18"/>
-                <w:szCs w:val="18"/>
-              </w:rPr>
-              <w:keepLines/>
-              <w:keepNext w:val="0"/>
-            </w:pPr>
-            <w:r>
-              <w:rPr>
-                <w:sz w:val="18"/>
-                <w:szCs w:val="18"/>
-              </w:rPr>
-              <w:t>line 1: 3</w:t>
-            </w:r>
-            <w:r>
-              <w:rPr>
-                <w:sz w:val="18"/>
-                <w:szCs w:val="18"/>
-                <w:vertAlign w:val="superscript"/>
-              </w:rPr>
-              <w:t>rd</w:t>
-            </w:r>
-            <w:r>
-              <w:rPr>
-                <w:sz w:val="18"/>
-                <w:szCs w:val="18"/>
-              </w:rPr>
-              <w:t xml:space="preserve"> </w:t>
-            </w:r>
-            <w:r>
-              <w:rPr>
-                <w:sz w:val="18"/>
-                <w:szCs w:val="18"/>
-              </w:rPr>
-              <w:t>Given Name Surname</w:t>
-            </w:r>
-            <w:r>
-              <w:rPr>
-                <w:sz w:val="18"/>
-                <w:szCs w:val="18"/>
-              </w:rPr>
-              <w:br/>
-              <w:t xml:space="preserve">line 2: </w:t>
-            </w:r>
-            <w:r>
-              <w:rPr>
-                <w:i/>
-                <w:sz w:val="18"/>
-                <w:szCs w:val="18"/>
-              </w:rPr>
-              <w:t xml:space="preserve">dept. name of organization (of </w:t>
-            </w:r>
-            <w:r>
-              <w:rPr>
-                <w:i/>
-                <w:iCs/>
-                <w:sz w:val="18"/>
-                <w:szCs w:val="18"/>
-              </w:rPr>
-              <w:t>Affiliation</w:t>
-            </w:r>
-            <w:r>
-              <w:rPr>
-                <w:i/>
-                <w:sz w:val="18"/>
-                <w:szCs w:val="18"/>
-              </w:rPr>
-              <w:t>)</w:t>
-            </w:r>
-            <w:r>
-              <w:rPr>
-                <w:sz w:val="18"/>
-                <w:szCs w:val="18"/>
-              </w:rPr>
-              <w:br/>
-              <w:t xml:space="preserve">line 3: </w:t>
-            </w:r>
-            <w:r>
-              <w:rPr>
-                <w:i/>
-                <w:sz w:val="18"/>
-                <w:szCs w:val="18"/>
-              </w:rPr>
-              <w:t>name of organization (of Affiliation)</w:t>
-            </w:r>
-            <w:r>
-              <w:rPr>
-                <w:i/>
-                <w:sz w:val="18"/>
-                <w:szCs w:val="18"/>
-              </w:rPr>
               <w:br/>
             </w:r>
             <w:r>
-              <w:rPr>
-                <w:sz w:val="18"/>
-                <w:szCs w:val="18"/>
-              </w:rPr>
-              <w:t>line 4: City, Country</w:t>
+              <w:t>Harbin Institute of Technology, Shenzhen</w:t>
             </w:r>
             <w:r>
-              <w:rPr>
-                <w:sz w:val="18"/>
-                <w:szCs w:val="18"/>
-              </w:rPr>
               <w:br/>
-              <w:t>line 5: email address</w:t>
             </w:r>
             <w:r>
-              <w:rPr>
-                <w:sz w:val="18"/>
-                <w:szCs w:val="18"/>
-              </w:rPr>
-              <w:t xml:space="preserve"> or ORCID</w:t>
+              <w:t>Shenzhen, China</w:t>
+            </w:r>
+            <w:r>
+              <w:br/>
+            </w:r>
+            <w:r>
+              <w:t>2024312513@stu.hit.edu.cn</w:t>
             </w:r>
           </w:p>
         </w:tc>

</xml_diff>